<commit_message>
docs: track the SRS bundle, feature lists and the admin login mockup
Bring the untracked deliverables under version control:

- docs/share/SheDrive_SRS_v0.2_Bundle/ -- the SRS v0.2 document and its eight
  diagrams, alongside the existing handover docs.
- The two rider feature-list documents.
- The admin panel sign-in mockup, which was sitting in
  "Design/Driver App/New folder/" under a raw screenshot filename. It is an
  admin screen, not a driver one, so it moves to "Design/Admin Panel/Login.png"
  to match the naming used throughout Design/.

Ignore two things deliberately: the raw SheDrive.AdminPanel_v18-08-2026 kit
drop (~20 MB, and the parts the portal uses are already vendored into
shedrive-web/admin-v2/vendor/), and the SRS .zip that duplicates the unpacked
bundle now tracked beside it. Also ignore the ad-hoc Azure DevOps query dumps.

Co-Authored-By: Claude Opus 5 <noreply@anthropic.com>
</commit_message>
<xml_diff>
--- a/SheDrive Questions.docx
+++ b/SheDrive Questions.docx
@@ -86,11 +86,7 @@
           </w:pPr>
           <w:r>
             <w:fldChar w:fldCharType="begin"/>
-          </w:r>
-          <w:r>
             <w:instrText xml:space="preserve"> TOC \o "1-3" \h \z \u </w:instrText>
-          </w:r>
-          <w:r>
             <w:fldChar w:fldCharType="separate"/>
           </w:r>
           <w:bookmarkStart w:id="0" w:name="_GoBack"/>
@@ -101,12 +97,6 @@
               <w:noProof/>
             </w:rPr>
             <w:fldChar w:fldCharType="begin"/>
-          </w:r>
-          <w:r>
-            <w:rPr>
-              <w:rStyle w:val="Hyperlink"/>
-              <w:noProof/>
-            </w:rPr>
             <w:instrText xml:space="preserve"> </w:instrText>
           </w:r>
           <w:r>
@@ -121,18 +111,6 @@
               <w:noProof/>
             </w:rPr>
             <w:instrText xml:space="preserve"> </w:instrText>
-          </w:r>
-          <w:r>
-            <w:rPr>
-              <w:rStyle w:val="Hyperlink"/>
-              <w:noProof/>
-            </w:rPr>
-          </w:r>
-          <w:r>
-            <w:rPr>
-              <w:rStyle w:val="Hyperlink"/>
-              <w:noProof/>
-            </w:rPr>
             <w:fldChar w:fldCharType="separate"/>
           </w:r>
           <w:r>
@@ -153,46 +131,10 @@
               <w:webHidden/>
             </w:rPr>
             <w:tab/>
-          </w:r>
-          <w:r>
-            <w:rPr>
-              <w:noProof/>
-              <w:webHidden/>
-            </w:rPr>
             <w:fldChar w:fldCharType="begin"/>
-          </w:r>
-          <w:r>
-            <w:rPr>
-              <w:noProof/>
-              <w:webHidden/>
-            </w:rPr>
             <w:instrText xml:space="preserve"> PAGEREF _Toc233771104 \h </w:instrText>
-          </w:r>
-          <w:r>
-            <w:rPr>
-              <w:noProof/>
-              <w:webHidden/>
-            </w:rPr>
-          </w:r>
-          <w:r>
-            <w:rPr>
-              <w:noProof/>
-              <w:webHidden/>
-            </w:rPr>
             <w:fldChar w:fldCharType="separate"/>
-          </w:r>
-          <w:r>
-            <w:rPr>
-              <w:noProof/>
-              <w:webHidden/>
-            </w:rPr>
             <w:t>2</w:t>
-          </w:r>
-          <w:r>
-            <w:rPr>
-              <w:noProof/>
-              <w:webHidden/>
-            </w:rPr>
             <w:fldChar w:fldCharType="end"/>
           </w:r>
           <w:r>
@@ -233,46 +175,10 @@
                 <w:webHidden/>
               </w:rPr>
               <w:tab/>
-            </w:r>
-            <w:r>
-              <w:rPr>
-                <w:noProof/>
-                <w:webHidden/>
-              </w:rPr>
               <w:fldChar w:fldCharType="begin"/>
-            </w:r>
-            <w:r>
-              <w:rPr>
-                <w:noProof/>
-                <w:webHidden/>
-              </w:rPr>
               <w:instrText xml:space="preserve"> PAGEREF _Toc233771105 \h </w:instrText>
-            </w:r>
-            <w:r>
-              <w:rPr>
-                <w:noProof/>
-                <w:webHidden/>
-              </w:rPr>
-            </w:r>
-            <w:r>
-              <w:rPr>
-                <w:noProof/>
-                <w:webHidden/>
-              </w:rPr>
               <w:fldChar w:fldCharType="separate"/>
-            </w:r>
-            <w:r>
-              <w:rPr>
-                <w:noProof/>
-                <w:webHidden/>
-              </w:rPr>
               <w:t>2</w:t>
-            </w:r>
-            <w:r>
-              <w:rPr>
-                <w:noProof/>
-                <w:webHidden/>
-              </w:rPr>
               <w:fldChar w:fldCharType="end"/>
             </w:r>
           </w:hyperlink>
@@ -307,46 +213,10 @@
                 <w:webHidden/>
               </w:rPr>
               <w:tab/>
-            </w:r>
-            <w:r>
-              <w:rPr>
-                <w:noProof/>
-                <w:webHidden/>
-              </w:rPr>
               <w:fldChar w:fldCharType="begin"/>
-            </w:r>
-            <w:r>
-              <w:rPr>
-                <w:noProof/>
-                <w:webHidden/>
-              </w:rPr>
               <w:instrText xml:space="preserve"> PAGEREF _Toc233771106 \h </w:instrText>
-            </w:r>
-            <w:r>
-              <w:rPr>
-                <w:noProof/>
-                <w:webHidden/>
-              </w:rPr>
-            </w:r>
-            <w:r>
-              <w:rPr>
-                <w:noProof/>
-                <w:webHidden/>
-              </w:rPr>
               <w:fldChar w:fldCharType="separate"/>
-            </w:r>
-            <w:r>
-              <w:rPr>
-                <w:noProof/>
-                <w:webHidden/>
-              </w:rPr>
               <w:t>2</w:t>
-            </w:r>
-            <w:r>
-              <w:rPr>
-                <w:noProof/>
-                <w:webHidden/>
-              </w:rPr>
               <w:fldChar w:fldCharType="end"/>
             </w:r>
           </w:hyperlink>
@@ -381,46 +251,10 @@
                 <w:webHidden/>
               </w:rPr>
               <w:tab/>
-            </w:r>
-            <w:r>
-              <w:rPr>
-                <w:noProof/>
-                <w:webHidden/>
-              </w:rPr>
               <w:fldChar w:fldCharType="begin"/>
-            </w:r>
-            <w:r>
-              <w:rPr>
-                <w:noProof/>
-                <w:webHidden/>
-              </w:rPr>
               <w:instrText xml:space="preserve"> PAGEREF _Toc233771107 \h </w:instrText>
-            </w:r>
-            <w:r>
-              <w:rPr>
-                <w:noProof/>
-                <w:webHidden/>
-              </w:rPr>
-            </w:r>
-            <w:r>
-              <w:rPr>
-                <w:noProof/>
-                <w:webHidden/>
-              </w:rPr>
               <w:fldChar w:fldCharType="separate"/>
-            </w:r>
-            <w:r>
-              <w:rPr>
-                <w:noProof/>
-                <w:webHidden/>
-              </w:rPr>
               <w:t>2</w:t>
-            </w:r>
-            <w:r>
-              <w:rPr>
-                <w:noProof/>
-                <w:webHidden/>
-              </w:rPr>
               <w:fldChar w:fldCharType="end"/>
             </w:r>
           </w:hyperlink>
@@ -455,46 +289,10 @@
                 <w:webHidden/>
               </w:rPr>
               <w:tab/>
-            </w:r>
-            <w:r>
-              <w:rPr>
-                <w:noProof/>
-                <w:webHidden/>
-              </w:rPr>
               <w:fldChar w:fldCharType="begin"/>
-            </w:r>
-            <w:r>
-              <w:rPr>
-                <w:noProof/>
-                <w:webHidden/>
-              </w:rPr>
               <w:instrText xml:space="preserve"> PAGEREF _Toc233771108 \h </w:instrText>
-            </w:r>
-            <w:r>
-              <w:rPr>
-                <w:noProof/>
-                <w:webHidden/>
-              </w:rPr>
-            </w:r>
-            <w:r>
-              <w:rPr>
-                <w:noProof/>
-                <w:webHidden/>
-              </w:rPr>
               <w:fldChar w:fldCharType="separate"/>
-            </w:r>
-            <w:r>
-              <w:rPr>
-                <w:noProof/>
-                <w:webHidden/>
-              </w:rPr>
               <w:t>2</w:t>
-            </w:r>
-            <w:r>
-              <w:rPr>
-                <w:noProof/>
-                <w:webHidden/>
-              </w:rPr>
               <w:fldChar w:fldCharType="end"/>
             </w:r>
           </w:hyperlink>
@@ -529,46 +327,10 @@
                 <w:webHidden/>
               </w:rPr>
               <w:tab/>
-            </w:r>
-            <w:r>
-              <w:rPr>
-                <w:noProof/>
-                <w:webHidden/>
-              </w:rPr>
               <w:fldChar w:fldCharType="begin"/>
-            </w:r>
-            <w:r>
-              <w:rPr>
-                <w:noProof/>
-                <w:webHidden/>
-              </w:rPr>
               <w:instrText xml:space="preserve"> PAGEREF _Toc233771109 \h </w:instrText>
-            </w:r>
-            <w:r>
-              <w:rPr>
-                <w:noProof/>
-                <w:webHidden/>
-              </w:rPr>
-            </w:r>
-            <w:r>
-              <w:rPr>
-                <w:noProof/>
-                <w:webHidden/>
-              </w:rPr>
               <w:fldChar w:fldCharType="separate"/>
-            </w:r>
-            <w:r>
-              <w:rPr>
-                <w:noProof/>
-                <w:webHidden/>
-              </w:rPr>
               <w:t>2</w:t>
-            </w:r>
-            <w:r>
-              <w:rPr>
-                <w:noProof/>
-                <w:webHidden/>
-              </w:rPr>
               <w:fldChar w:fldCharType="end"/>
             </w:r>
           </w:hyperlink>
@@ -603,46 +365,10 @@
                 <w:webHidden/>
               </w:rPr>
               <w:tab/>
-            </w:r>
-            <w:r>
-              <w:rPr>
-                <w:noProof/>
-                <w:webHidden/>
-              </w:rPr>
               <w:fldChar w:fldCharType="begin"/>
-            </w:r>
-            <w:r>
-              <w:rPr>
-                <w:noProof/>
-                <w:webHidden/>
-              </w:rPr>
               <w:instrText xml:space="preserve"> PAGEREF _Toc233771110 \h </w:instrText>
-            </w:r>
-            <w:r>
-              <w:rPr>
-                <w:noProof/>
-                <w:webHidden/>
-              </w:rPr>
-            </w:r>
-            <w:r>
-              <w:rPr>
-                <w:noProof/>
-                <w:webHidden/>
-              </w:rPr>
               <w:fldChar w:fldCharType="separate"/>
-            </w:r>
-            <w:r>
-              <w:rPr>
-                <w:noProof/>
-                <w:webHidden/>
-              </w:rPr>
               <w:t>2</w:t>
-            </w:r>
-            <w:r>
-              <w:rPr>
-                <w:noProof/>
-                <w:webHidden/>
-              </w:rPr>
               <w:fldChar w:fldCharType="end"/>
             </w:r>
           </w:hyperlink>
@@ -674,46 +400,10 @@
                 <w:webHidden/>
               </w:rPr>
               <w:tab/>
-            </w:r>
-            <w:r>
-              <w:rPr>
-                <w:noProof/>
-                <w:webHidden/>
-              </w:rPr>
               <w:fldChar w:fldCharType="begin"/>
-            </w:r>
-            <w:r>
-              <w:rPr>
-                <w:noProof/>
-                <w:webHidden/>
-              </w:rPr>
               <w:instrText xml:space="preserve"> PAGEREF _Toc233771111 \h </w:instrText>
-            </w:r>
-            <w:r>
-              <w:rPr>
-                <w:noProof/>
-                <w:webHidden/>
-              </w:rPr>
-            </w:r>
-            <w:r>
-              <w:rPr>
-                <w:noProof/>
-                <w:webHidden/>
-              </w:rPr>
               <w:fldChar w:fldCharType="separate"/>
-            </w:r>
-            <w:r>
-              <w:rPr>
-                <w:noProof/>
-                <w:webHidden/>
-              </w:rPr>
               <w:t>2</w:t>
-            </w:r>
-            <w:r>
-              <w:rPr>
-                <w:noProof/>
-                <w:webHidden/>
-              </w:rPr>
               <w:fldChar w:fldCharType="end"/>
             </w:r>
           </w:hyperlink>
@@ -744,46 +434,10 @@
                 <w:webHidden/>
               </w:rPr>
               <w:tab/>
-            </w:r>
-            <w:r>
-              <w:rPr>
-                <w:noProof/>
-                <w:webHidden/>
-              </w:rPr>
               <w:fldChar w:fldCharType="begin"/>
-            </w:r>
-            <w:r>
-              <w:rPr>
-                <w:noProof/>
-                <w:webHidden/>
-              </w:rPr>
               <w:instrText xml:space="preserve"> PAGEREF _Toc233771112 \h </w:instrText>
-            </w:r>
-            <w:r>
-              <w:rPr>
-                <w:noProof/>
-                <w:webHidden/>
-              </w:rPr>
-            </w:r>
-            <w:r>
-              <w:rPr>
-                <w:noProof/>
-                <w:webHidden/>
-              </w:rPr>
               <w:fldChar w:fldCharType="separate"/>
-            </w:r>
-            <w:r>
-              <w:rPr>
-                <w:noProof/>
-                <w:webHidden/>
-              </w:rPr>
               <w:t>2</w:t>
-            </w:r>
-            <w:r>
-              <w:rPr>
-                <w:noProof/>
-                <w:webHidden/>
-              </w:rPr>
               <w:fldChar w:fldCharType="end"/>
             </w:r>
           </w:hyperlink>
@@ -814,46 +468,10 @@
                 <w:webHidden/>
               </w:rPr>
               <w:tab/>
-            </w:r>
-            <w:r>
-              <w:rPr>
-                <w:noProof/>
-                <w:webHidden/>
-              </w:rPr>
               <w:fldChar w:fldCharType="begin"/>
-            </w:r>
-            <w:r>
-              <w:rPr>
-                <w:noProof/>
-                <w:webHidden/>
-              </w:rPr>
               <w:instrText xml:space="preserve"> PAGEREF _Toc233771113 \h </w:instrText>
-            </w:r>
-            <w:r>
-              <w:rPr>
-                <w:noProof/>
-                <w:webHidden/>
-              </w:rPr>
-            </w:r>
-            <w:r>
-              <w:rPr>
-                <w:noProof/>
-                <w:webHidden/>
-              </w:rPr>
               <w:fldChar w:fldCharType="separate"/>
-            </w:r>
-            <w:r>
-              <w:rPr>
-                <w:noProof/>
-                <w:webHidden/>
-              </w:rPr>
               <w:t>3</w:t>
-            </w:r>
-            <w:r>
-              <w:rPr>
-                <w:noProof/>
-                <w:webHidden/>
-              </w:rPr>
               <w:fldChar w:fldCharType="end"/>
             </w:r>
           </w:hyperlink>
@@ -884,46 +502,44 @@
                 <w:webHidden/>
               </w:rPr>
               <w:tab/>
+              <w:fldChar w:fldCharType="begin"/>
+              <w:instrText xml:space="preserve"> PAGEREF _Toc233771114 \h </w:instrText>
+              <w:fldChar w:fldCharType="separate"/>
+              <w:t>4</w:t>
+              <w:fldChar w:fldCharType="end"/>
+            </w:r>
+          </w:hyperlink>
+        </w:p>
+        <w:p>
+          <w:pPr>
+            <w:pStyle w:val="TOC2"/>
+            <w:tabs>
+              <w:tab w:val="right" w:leader="dot" w:pos="9016"/>
+            </w:tabs>
+            <w:rPr>
+              <w:rFonts w:eastAsiaTheme="minorEastAsia"/>
+              <w:noProof/>
+              <w:lang w:val="en-US"/>
+            </w:rPr>
+          </w:pPr>
+          <w:hyperlink w:anchor="_Toc233771115" w:history="1">
+            <w:r>
+              <w:rPr>
+                <w:rStyle w:val="Hyperlink"/>
+                <w:noProof/>
+              </w:rPr>
+              <w:t>Organization Structure &amp; Operations Team</w:t>
             </w:r>
             <w:r>
               <w:rPr>
                 <w:noProof/>
                 <w:webHidden/>
               </w:rPr>
+              <w:tab/>
               <w:fldChar w:fldCharType="begin"/>
-            </w:r>
-            <w:r>
-              <w:rPr>
-                <w:noProof/>
-                <w:webHidden/>
-              </w:rPr>
-              <w:instrText xml:space="preserve"> PAGEREF _Toc233771114 \h </w:instrText>
-            </w:r>
-            <w:r>
-              <w:rPr>
-                <w:noProof/>
-                <w:webHidden/>
-              </w:rPr>
-            </w:r>
-            <w:r>
-              <w:rPr>
-                <w:noProof/>
-                <w:webHidden/>
-              </w:rPr>
+              <w:instrText xml:space="preserve"> PAGEREF _Toc233771115 \h </w:instrText>
               <w:fldChar w:fldCharType="separate"/>
-            </w:r>
-            <w:r>
-              <w:rPr>
-                <w:noProof/>
-                <w:webHidden/>
-              </w:rPr>
-              <w:t>4</w:t>
-            </w:r>
-            <w:r>
-              <w:rPr>
-                <w:noProof/>
-                <w:webHidden/>
-              </w:rPr>
+              <w:t>5</w:t>
               <w:fldChar w:fldCharType="end"/>
             </w:r>
           </w:hyperlink>
@@ -1029,25 +645,7 @@
           <w:bCs/>
           <w:lang w:eastAsia="en-GB"/>
         </w:rPr>
-        <w:t xml:space="preserve">To answer some questions that needs to clarified from the </w:t>
-      </w:r>
-      <w:r>
-        <w:rPr>
-          <w:rFonts w:ascii="Segoe UI" w:eastAsia="Times New Roman" w:hAnsi="Segoe UI" w:cs="Segoe UI"/>
-          <w:b/>
-          <w:bCs/>
-          <w:lang w:eastAsia="en-GB"/>
-        </w:rPr>
-        <w:t>stakeholders</w:t>
-      </w:r>
-      <w:r>
-        <w:rPr>
-          <w:rFonts w:ascii="Segoe UI" w:eastAsia="Times New Roman" w:hAnsi="Segoe UI" w:cs="Segoe UI"/>
-          <w:b/>
-          <w:bCs/>
-          <w:lang w:eastAsia="en-GB"/>
-        </w:rPr>
-        <w:t>.</w:t>
+        <w:t xml:space="preserve">To answer some questions that needs to clarified from the stakeholders.</w:t>
       </w:r>
       <w:bookmarkEnd w:id="3"/>
     </w:p>
@@ -1227,35 +825,7 @@
                 <w:rFonts w:ascii="Segoe UI" w:eastAsia="Times New Roman" w:hAnsi="Segoe UI" w:cs="Segoe UI"/>
                 <w:lang w:eastAsia="en-GB"/>
               </w:rPr>
-              <w:t>30</w:t>
-            </w:r>
-            <w:r>
-              <w:rPr>
-                <w:rFonts w:ascii="Segoe UI" w:eastAsia="Times New Roman" w:hAnsi="Segoe UI" w:cs="Segoe UI"/>
-                <w:lang w:eastAsia="en-GB"/>
-              </w:rPr>
-              <w:t>-</w:t>
-            </w:r>
-            <w:r>
-              <w:rPr>
-                <w:rFonts w:ascii="Segoe UI" w:eastAsia="Times New Roman" w:hAnsi="Segoe UI" w:cs="Segoe UI"/>
-                <w:lang w:eastAsia="en-GB"/>
-              </w:rPr>
-              <w:t>June</w:t>
-            </w:r>
-            <w:r>
-              <w:rPr>
-                <w:rFonts w:ascii="Segoe UI" w:eastAsia="Times New Roman" w:hAnsi="Segoe UI" w:cs="Segoe UI"/>
-                <w:lang w:eastAsia="en-GB"/>
-              </w:rPr>
-              <w:t>-202</w:t>
-            </w:r>
-            <w:r>
-              <w:rPr>
-                <w:rFonts w:ascii="Segoe UI" w:eastAsia="Times New Roman" w:hAnsi="Segoe UI" w:cs="Segoe UI"/>
-                <w:lang w:eastAsia="en-GB"/>
-              </w:rPr>
-              <w:t>6</w:t>
+              <w:t>30-June-2026</w:t>
             </w:r>
           </w:p>
         </w:tc>
@@ -1287,14 +857,7 @@
                 <w:rFonts w:ascii="Segoe UI" w:eastAsia="Times New Roman" w:hAnsi="Segoe UI" w:cs="Segoe UI"/>
                 <w:lang w:eastAsia="en-GB"/>
               </w:rPr>
-              <w:t xml:space="preserve"> Senior </w:t>
-            </w:r>
-            <w:r>
-              <w:rPr>
-                <w:rFonts w:ascii="Segoe UI" w:eastAsia="Times New Roman" w:hAnsi="Segoe UI" w:cs="Segoe UI"/>
-                <w:lang w:eastAsia="en-GB"/>
-              </w:rPr>
-              <w:t>Product Owner</w:t>
+              <w:t xml:space="preserve"> Senior Product Owner</w:t>
             </w:r>
           </w:p>
         </w:tc>
@@ -1403,14 +966,7 @@
           <w:rFonts w:ascii="Segoe UI" w:eastAsia="Times New Roman" w:hAnsi="Segoe UI" w:cs="Segoe UI"/>
           <w:lang w:eastAsia="en-GB"/>
         </w:rPr>
-        <w:t xml:space="preserve"> Senior </w:t>
-      </w:r>
-      <w:r>
-        <w:rPr>
-          <w:rFonts w:ascii="Segoe UI" w:eastAsia="Times New Roman" w:hAnsi="Segoe UI" w:cs="Segoe UI"/>
-          <w:lang w:eastAsia="en-GB"/>
-        </w:rPr>
-        <w:t>Product Owner</w:t>
+        <w:t xml:space="preserve"> Senior Product Owner</w:t>
       </w:r>
     </w:p>
     <w:p>
@@ -1652,19 +1208,7 @@
           <w:sz w:val="22"/>
           <w:szCs w:val="22"/>
         </w:rPr>
-        <w:t xml:space="preserve">2. </w:t>
-      </w:r>
-      <w:r>
-        <w:rPr>
-          <w:rStyle w:val="Strong"/>
-          <w:rFonts w:ascii="Segoe UI" w:hAnsi="Segoe UI" w:cs="Segoe UI"/>
-          <w:b w:val="0"/>
-          <w:bCs w:val="0"/>
-          <w:color w:val="918655" w:themeColor="accent6"/>
-          <w:sz w:val="22"/>
-          <w:szCs w:val="22"/>
-        </w:rPr>
-        <w:t>Questions &amp; Inquiries</w:t>
+        <w:t xml:space="preserve">2. Questions &amp; Inquiries</w:t>
       </w:r>
       <w:bookmarkEnd w:id="8"/>
     </w:p>
@@ -1681,15 +1225,7 @@
     </w:p>
     <w:p>
       <w:r>
-        <w:t xml:space="preserve">Context: We need to define how </w:t>
-      </w:r>
-      <w:proofErr w:type="spellStart"/>
-      <w:r>
-        <w:t>SheDrive</w:t>
-      </w:r>
-      <w:proofErr w:type="spellEnd"/>
-      <w:r>
-        <w:t xml:space="preserve"> settles balances with drivers, and how money owed </w:t>
+        <w:t xml:space="preserve">Context: We need to define how SheDrive settles balances with drivers, and how money owed </w:t>
       </w:r>
       <w:r>
         <w:rPr>
@@ -1699,15 +1235,7 @@
         <w:t>to</w:t>
       </w:r>
       <w:r>
-        <w:t> </w:t>
-      </w:r>
-      <w:proofErr w:type="spellStart"/>
-      <w:r>
-        <w:t>SheDrive</w:t>
-      </w:r>
-      <w:proofErr w:type="spellEnd"/>
-      <w:r>
-        <w:t xml:space="preserve"> by a driver is collected and recorded, so that the system can track every transaction accurately.</w:t>
+        <w:t xml:space="preserve"> SheDrive by a driver is collected and recorded, so that the system can track every transaction accurately.</w:t>
       </w:r>
     </w:p>
     <w:p>
@@ -1723,23 +1251,7 @@
         </w:numPr>
       </w:pPr>
       <w:r>
-        <w:t xml:space="preserve">How will </w:t>
-      </w:r>
-      <w:proofErr w:type="spellStart"/>
-      <w:r>
-        <w:t>SheDrive</w:t>
-      </w:r>
-      <w:proofErr w:type="spellEnd"/>
-      <w:r>
-        <w:t xml:space="preserve"> pay drivers their earnings — bank transfer, mobile wallet (e.g. Vodafone Cash / </w:t>
-      </w:r>
-      <w:proofErr w:type="spellStart"/>
-      <w:r>
-        <w:t>InstaPay</w:t>
-      </w:r>
-      <w:proofErr w:type="spellEnd"/>
-      <w:r>
-        <w:t>), cash, or a combination?</w:t>
+        <w:t xml:space="preserve">How will SheDrive pay drivers their earnings — bank transfer, mobile wallet (e.g. Vodafone Cash / InstaPay), cash, or a combination?</w:t>
       </w:r>
     </w:p>
     <w:p>
@@ -1788,13 +1300,8 @@
     </w:p>
     <w:p>
       <w:r>
-        <w:t xml:space="preserve">B. Money the Driver Owes </w:t>
-      </w:r>
-      <w:proofErr w:type="spellStart"/>
-      <w:r>
-        <w:t>SheDrive</w:t>
-      </w:r>
-      <w:proofErr w:type="spellEnd"/>
+        <w:t xml:space="preserve">B. Money the Driver Owes SheDrive</w:t>
+      </w:r>
     </w:p>
     <w:p>
       <w:pPr>
@@ -1805,15 +1312,7 @@
       </w:pPr>
       <w:r>
         <w:lastRenderedPageBreak/>
-        <w:t xml:space="preserve">How should a driver repay an outstanding balance — deduction from future earnings, direct deposit to a </w:t>
-      </w:r>
-      <w:proofErr w:type="spellStart"/>
-      <w:r>
-        <w:t>SheDrive</w:t>
-      </w:r>
-      <w:proofErr w:type="spellEnd"/>
-      <w:r>
-        <w:t xml:space="preserve"> account, mobile wallet transfer, or cash hand-off?</w:t>
+        <w:t xml:space="preserve">How should a driver repay an outstanding balance — deduction from future earnings, direct deposit to a SheDrive account, mobile wallet transfer, or cash hand-off?</w:t>
       </w:r>
     </w:p>
     <w:p>
@@ -1851,15 +1350,7 @@
         </w:numPr>
       </w:pPr>
       <w:r>
-        <w:t xml:space="preserve">Who is responsible for reconciliation on the </w:t>
-      </w:r>
-      <w:proofErr w:type="spellStart"/>
-      <w:r>
-        <w:t>SheDrive</w:t>
-      </w:r>
-      <w:proofErr w:type="spellEnd"/>
-      <w:r>
-        <w:t xml:space="preserve"> side (finance team, operations, automated system)?</w:t>
+        <w:t xml:space="preserve">Who is responsible for reconciliation on the SheDrive side (finance team, operations, automated system)?</w:t>
       </w:r>
     </w:p>
     <w:p>
@@ -1892,15 +1383,7 @@
         </w:numPr>
       </w:pPr>
       <w:r>
-        <w:t xml:space="preserve">Will there be integration with an external accounting system or payment gateway, or is this fully managed inside the </w:t>
-      </w:r>
-      <w:proofErr w:type="spellStart"/>
-      <w:r>
-        <w:t>SheDrive</w:t>
-      </w:r>
-      <w:proofErr w:type="spellEnd"/>
-      <w:r>
-        <w:t xml:space="preserve"> platform?</w:t>
+        <w:t xml:space="preserve">Will there be integration with an external accounting system or payment gateway, or is this fully managed inside the SheDrive platform?</w:t>
       </w:r>
     </w:p>
     <w:p>
@@ -1915,15 +1398,7 @@
     </w:p>
     <w:p>
       <w:r>
-        <w:t>Context: </w:t>
-      </w:r>
-      <w:proofErr w:type="spellStart"/>
-      <w:r>
-        <w:t>SheDrive's</w:t>
-      </w:r>
-      <w:proofErr w:type="spellEnd"/>
-      <w:r>
-        <w:t xml:space="preserve"> positioning is safety-first, with the SOS direct line as a Phase 1 pillar. We need to confirm the operational model behind the SOS feature so the system supports the correct workflow.</w:t>
+        <w:t xml:space="preserve">Context: SheDrive's positioning is safety-first, with the SOS direct line as a Phase 1 pillar. We need to confirm the operational model behind the SOS feature so the system supports the correct workflow.</w:t>
       </w:r>
     </w:p>
     <w:p>
@@ -1939,15 +1414,7 @@
         </w:numPr>
       </w:pPr>
       <w:r>
-        <w:t xml:space="preserve">Will </w:t>
-      </w:r>
-      <w:proofErr w:type="spellStart"/>
-      <w:r>
-        <w:t>SheDrive</w:t>
-      </w:r>
-      <w:proofErr w:type="spellEnd"/>
-      <w:r>
-        <w:t xml:space="preserve"> operate a dedicated control room / monitoring center to receive and act on SOS alerts?</w:t>
+        <w:t xml:space="preserve">Will SheDrive operate a dedicated control room / monitoring center to receive and act on SOS alerts?</w:t>
       </w:r>
     </w:p>
     <w:p>
@@ -1980,15 +1447,7 @@
         </w:numPr>
       </w:pPr>
       <w:r>
-        <w:t xml:space="preserve">Will there be emergency personnel on the ground (field responders) employed or contracted by </w:t>
-      </w:r>
-      <w:proofErr w:type="spellStart"/>
-      <w:r>
-        <w:t>SheDrive</w:t>
-      </w:r>
-      <w:proofErr w:type="spellEnd"/>
-      <w:r>
-        <w:t>, or do we rely entirely on external services (police, ambulance, Ministry of Interior)?</w:t>
+        <w:t xml:space="preserve">Will there be emergency personnel on the ground (field responders) employed or contracted by SheDrive, or do we rely entirely on external services (police, ambulance, Ministry of Interior)?</w:t>
       </w:r>
     </w:p>
     <w:p>
@@ -2164,18 +1623,7 @@
     <w:p/>
     <w:p>
       <w:r>
-        <w:t>Context: </w:t>
-      </w:r>
-      <w:r>
-        <w:t xml:space="preserve">who will be </w:t>
-      </w:r>
-      <w:proofErr w:type="spellStart"/>
-      <w:r>
-        <w:t>SheDrive’s</w:t>
-      </w:r>
-      <w:proofErr w:type="spellEnd"/>
-      <w:r>
-        <w:t xml:space="preserve"> external providers for the different services include payment, SMS and Maps providers.</w:t>
+        <w:t xml:space="preserve">Context: who will be SheDrive’s external providers for the different services include payment, SMS and Maps providers.</w:t>
       </w:r>
     </w:p>
     <w:p>
@@ -2186,21 +1634,8 @@
           <w:numId w:val="28"/>
         </w:numPr>
       </w:pPr>
-      <w:proofErr w:type="gramStart"/>
-      <w:r>
-        <w:t>Payment :</w:t>
-      </w:r>
-      <w:proofErr w:type="gramEnd"/>
-      <w:r>
-        <w:t xml:space="preserve"> </w:t>
-      </w:r>
-      <w:proofErr w:type="spellStart"/>
-      <w:r>
-        <w:t>Paymob</w:t>
-      </w:r>
-      <w:proofErr w:type="spellEnd"/>
-      <w:r>
-        <w:t xml:space="preserve"> ( to be confirmed.)</w:t>
+      <w:r>
+        <w:t xml:space="preserve">Payment : Paymob ( to be confirmed.)</w:t>
       </w:r>
     </w:p>
     <w:p>
@@ -2271,6 +1706,196 @@
           <w:szCs w:val="22"/>
         </w:rPr>
       </w:pPr>
+    </w:p>
+    <w:p>
+      <w:pPr>
+        <w:pStyle w:val="Heading2"/>
+      </w:pPr>
+      <w:bookmarkStart w:id="12" w:name="_Toc233771115"/>
+      <w:r>
+        <w:t>Organization Structure &amp; Operations Team</w:t>
+      </w:r>
+      <w:bookmarkEnd w:id="12"/>
+    </w:p>
+    <w:p>
+      <w:r>
+        <w:t xml:space="preserve">Context: SheDrive's internal organization structure defines which roles, permissions, and access levels the system (Admin Panel) must support, and the operations team is what will run the day-to-day service. We need to understand both so that the system's role-based access and admin workflows match how the company actually operates.</w:t>
+      </w:r>
+    </w:p>
+    <w:p>
+      <w:r>
+        <w:t xml:space="preserve">A. Organization Structure &amp; System Roles</w:t>
+      </w:r>
+    </w:p>
+    <w:p>
+      <w:pPr>
+        <w:numPr>
+          <w:ilvl w:val="0"/>
+          <w:numId w:val="29"/>
+        </w:numPr>
+      </w:pPr>
+      <w:r>
+        <w:t xml:space="preserve">What are the main departments and functions in SheDrive's organization (e.g. operations, driver onboarding &amp; verification, rider &amp; driver support, safety, finance, marketing, management)?</w:t>
+      </w:r>
+    </w:p>
+    <w:p>
+      <w:pPr>
+        <w:numPr>
+          <w:ilvl w:val="0"/>
+          <w:numId w:val="29"/>
+        </w:numPr>
+      </w:pPr>
+      <w:r>
+        <w:t xml:space="preserve">Which of these functions need access to the SheDrive system (Admin Panel), and which operate entirely outside it?</w:t>
+      </w:r>
+    </w:p>
+    <w:p>
+      <w:pPr>
+        <w:numPr>
+          <w:ilvl w:val="0"/>
+          <w:numId w:val="29"/>
+        </w:numPr>
+      </w:pPr>
+      <w:r>
+        <w:t xml:space="preserve">How should the organization hierarchy be reflected in the system's roles and permissions — i.e. what distinct roles should exist (e.g. Super Admin, Operations Manager, Onboarding Agent, Support Agent, Finance, Safety / SOS Operator)?</w:t>
+      </w:r>
+    </w:p>
+    <w:p>
+      <w:pPr>
+        <w:numPr>
+          <w:ilvl w:val="0"/>
+          <w:numId w:val="29"/>
+        </w:numPr>
+      </w:pPr>
+      <w:r>
+        <w:t xml:space="preserve">For each role, what should the user be able to do versus only view (e.g. approve or reject drivers, suspend accounts, issue refunds, view financial reports, trigger or close SOS cases)?</w:t>
+      </w:r>
+    </w:p>
+    <w:p>
+      <w:pPr>
+        <w:numPr>
+          <w:ilvl w:val="0"/>
+          <w:numId w:val="29"/>
+        </w:numPr>
+      </w:pPr>
+      <w:r>
+        <w:t xml:space="preserve">Are there actions that require approval from a higher role (e.g. a manager must approve a refund above a certain amount, or a driver suspension)?</w:t>
+      </w:r>
+    </w:p>
+    <w:p>
+      <w:pPr>
+        <w:numPr>
+          <w:ilvl w:val="0"/>
+          <w:numId w:val="29"/>
+        </w:numPr>
+      </w:pPr>
+      <w:r>
+        <w:t xml:space="preserve">Should there be segregation of duties between departments (e.g. finance can settle payouts but cannot approve drivers; operations can approve drivers but cannot access financial reports)?</w:t>
+      </w:r>
+    </w:p>
+    <w:p>
+      <w:pPr>
+        <w:numPr>
+          <w:ilvl w:val="0"/>
+          <w:numId w:val="29"/>
+        </w:numPr>
+      </w:pPr>
+      <w:r>
+        <w:t xml:space="preserve">Will one person ever hold more than one role, or is each role tied to a dedicated person or team?</w:t>
+      </w:r>
+    </w:p>
+    <w:p>
+      <w:pPr>
+        <w:numPr>
+          <w:ilvl w:val="0"/>
+          <w:numId w:val="29"/>
+        </w:numPr>
+      </w:pPr>
+      <w:r>
+        <w:t xml:space="preserve">Who is the top-level administrator responsible for creating and managing other users, roles, and permissions in the system?</w:t>
+      </w:r>
+    </w:p>
+    <w:p>
+      <w:r>
+        <w:t xml:space="preserve">B. Operations Team</w:t>
+      </w:r>
+    </w:p>
+    <w:p>
+      <w:pPr>
+        <w:numPr>
+          <w:ilvl w:val="0"/>
+          <w:numId w:val="30"/>
+        </w:numPr>
+      </w:pPr>
+      <w:r>
+        <w:t xml:space="preserve">What functions will SheDrive's operations team cover day-to-day (driver onboarding &amp; vetting, live trip monitoring, rider &amp; driver support, safety / SOS handling, payouts &amp; finance, quality &amp; ratings)?</w:t>
+      </w:r>
+    </w:p>
+    <w:p>
+      <w:pPr>
+        <w:numPr>
+          <w:ilvl w:val="0"/>
+          <w:numId w:val="30"/>
+        </w:numPr>
+      </w:pPr>
+      <w:r>
+        <w:t xml:space="preserve">Roughly how large is the operations team expected to be at launch, and how is it structured (sub-teams, team leads, reporting lines)?</w:t>
+      </w:r>
+    </w:p>
+    <w:p>
+      <w:pPr>
+        <w:numPr>
+          <w:ilvl w:val="0"/>
+          <w:numId w:val="30"/>
+        </w:numPr>
+      </w:pPr>
+      <w:r>
+        <w:t xml:space="preserve">Will the operations team work in shifts / around the clock, or only during defined operating hours?</w:t>
+      </w:r>
+    </w:p>
+    <w:p>
+      <w:pPr>
+        <w:numPr>
+          <w:ilvl w:val="0"/>
+          <w:numId w:val="30"/>
+        </w:numPr>
+      </w:pPr>
+      <w:r>
+        <w:t xml:space="preserve">Which parts of operations will be handled in-house versus outsourced (e.g. a third-party call center for rider and driver support)?</w:t>
+      </w:r>
+    </w:p>
+    <w:p>
+      <w:pPr>
+        <w:numPr>
+          <w:ilvl w:val="0"/>
+          <w:numId w:val="30"/>
+        </w:numPr>
+      </w:pPr>
+      <w:r>
+        <w:t xml:space="preserve">What is the escalation path within operations (agent → team lead → operations manager → management)?</w:t>
+      </w:r>
+    </w:p>
+    <w:p>
+      <w:pPr>
+        <w:numPr>
+          <w:ilvl w:val="0"/>
+          <w:numId w:val="30"/>
+        </w:numPr>
+      </w:pPr>
+      <w:r>
+        <w:t xml:space="preserve">Which system screens or capabilities does each operations function need (e.g. onboarding needs the driver verification queue, support needs trip lookup and rider/driver profiles, finance needs the payouts and reconciliation screens)?</w:t>
+      </w:r>
+    </w:p>
+    <w:p>
+      <w:pPr>
+        <w:numPr>
+          <w:ilvl w:val="0"/>
+          <w:numId w:val="30"/>
+        </w:numPr>
+      </w:pPr>
+      <w:r>
+        <w:t xml:space="preserve">How will the operations team's performance be measured (KPIs such as onboarding turnaround time, support response time, SOS response time, driver utilization)?</w:t>
+      </w:r>
     </w:p>
     <w:sectPr>
       <w:headerReference w:type="even" r:id="rId7"/>
@@ -6081,6 +5706,18 @@
   </w:num>
   <w:num w:numId="28">
     <w:abstractNumId w:val="17"/>
+  </w:num>
+  <w:num w:numId="29">
+    <w:abstractNumId w:val="4"/>
+    <w:lvlOverride w:ilvl="0">
+      <w:startOverride w:val="1"/>
+    </w:lvlOverride>
+  </w:num>
+  <w:num w:numId="30">
+    <w:abstractNumId w:val="4"/>
+    <w:lvlOverride w:ilvl="0">
+      <w:startOverride w:val="1"/>
+    </w:lvlOverride>
   </w:num>
   <w:numIdMacAtCleanup w:val="20"/>
 </w:numbering>

</xml_diff>